<commit_message>
correct the mandat MSC
</commit_message>
<xml_diff>
--- a/frontend/api/templates/MANDAT MSC.docx
+++ b/frontend/api/templates/MANDAT MSC.docx
@@ -945,6 +945,14 @@
       <w:tblPr>
         <w:tblStyle w:val="Grilledutableau"/>
         <w:tblW w:w="4963" w:type="pct"/>
+        <w:tblBorders>
+          <w:top w:val="none" w:sz="0" w:space="0" w:color="auto"/>
+          <w:left w:val="none" w:sz="0" w:space="0" w:color="auto"/>
+          <w:bottom w:val="none" w:sz="0" w:space="0" w:color="auto"/>
+          <w:right w:val="none" w:sz="0" w:space="0" w:color="auto"/>
+          <w:insideH w:val="none" w:sz="0" w:space="0" w:color="auto"/>
+          <w:insideV w:val="none" w:sz="0" w:space="0" w:color="auto"/>
+        </w:tblBorders>
         <w:tblLook w:val="04A0" w:firstRow="1" w:lastRow="0" w:firstColumn="1" w:lastColumn="0" w:noHBand="0" w:noVBand="1"/>
       </w:tblPr>
       <w:tblGrid>

</xml_diff>

<commit_message>
Add mandat update vol 2
</commit_message>
<xml_diff>
--- a/frontend/api/templates/MANDAT MSC.docx
+++ b/frontend/api/templates/MANDAT MSC.docx
@@ -17,18 +17,6 @@
         </w:rPr>
         <w:t>{{client_name}}</w:t>
       </w:r>
-      <w:proofErr w:type="spellStart"/>
-      <w:r>
-        <w:rPr>
-          <w:color w:val="000000"/>
-        </w:rPr>
-      </w:r>
-      <w:proofErr w:type="spellEnd"/>
-      <w:r>
-        <w:rPr>
-          <w:color w:val="000000"/>
-        </w:rPr>
-      </w:r>
     </w:p>
     <w:p>
       <w:pPr>
@@ -146,18 +134,6 @@
         </w:rPr>
         <w:t>{{client_name}}</w:t>
       </w:r>
-      <w:proofErr w:type="spellStart"/>
-      <w:r>
-        <w:rPr>
-          <w:color w:val="000000"/>
-        </w:rPr>
-      </w:r>
-      <w:proofErr w:type="spellEnd"/>
-      <w:r>
-        <w:rPr>
-          <w:color w:val="000000"/>
-        </w:rPr>
-      </w:r>
       <w:r>
         <w:t xml:space="preserve">, </w:t>
       </w:r>
@@ -177,18 +153,6 @@
         </w:rPr>
         <w:t>{{transit_name}}</w:t>
       </w:r>
-      <w:proofErr w:type="spellStart"/>
-      <w:r>
-        <w:rPr>
-          <w:color w:val="000000"/>
-        </w:rPr>
-      </w:r>
-      <w:proofErr w:type="spellEnd"/>
-      <w:r>
-        <w:rPr>
-          <w:color w:val="000000"/>
-        </w:rPr>
-      </w:r>
       <w:r>
         <w:t xml:space="preserve"> pour agir en tant que notre</w:t>
       </w:r>
@@ -261,23 +225,8 @@
         </w:rPr>
         <w:t>{{transit_name}}</w:t>
       </w:r>
-      <w:proofErr w:type="spellStart"/>
-      <w:r>
-        <w:rPr>
-          <w:color w:val="000000"/>
-        </w:rPr>
-      </w:r>
-      <w:proofErr w:type="spellEnd"/>
-      <w:r>
-        <w:rPr>
-          <w:color w:val="000000"/>
-        </w:rPr>
-      </w:r>
-      <w:r>
-        <w:t xml:space="preserve"> </w:t>
-      </w:r>
-      <w:r>
-        <w:t>:</w:t>
+      <w:r>
+        <w:t> :</w:t>
       </w:r>
     </w:p>
     <w:p>
@@ -306,47 +255,20 @@
         </w:rPr>
         <w:t>{{transit_name}}</w:t>
       </w:r>
-      <w:proofErr w:type="spellStart"/>
+      <w:r>
+        <w:t xml:space="preserve"> à</w:t>
+      </w:r>
+      <w:r>
+        <w:t xml:space="preserve"> demander la livraison de la part de MSC</w:t>
+      </w:r>
+      <w:r>
+        <w:t>,</w:t>
+      </w:r>
       <w:r>
         <w:rPr>
           <w:color w:val="000000"/>
         </w:rPr>
-      </w:r>
-      <w:proofErr w:type="spellEnd"/>
-      <w:r>
-        <w:rPr>
-          <w:color w:val="000000"/>
-        </w:rPr>
-      </w:r>
-      <w:r>
-        <w:t xml:space="preserve"> à</w:t>
-      </w:r>
-      <w:r>
-        <w:t xml:space="preserve"> demander la livraison de la part de MSC</w:t>
-      </w:r>
-      <w:r>
-        <w:t>,</w:t>
-      </w:r>
-      <w:r>
-        <w:rPr>
-          <w:b w:val="0"/>
-          <w:color w:val="000000"/>
-        </w:rPr>
         <w:t xml:space="preserve"> des marchandises consignées ou endossées à </w:t>
-      </w:r>
-      <w:r>
-        <w:rPr>
-          <w:b/>
-          <w:i w:val="0"/>
-          <w:color w:val="000000"/>
-        </w:rPr>
-        <w:t>{{client_name}}</w:t>
-      </w:r>
-      <w:r>
-        <w:t xml:space="preserve"> </w:t>
-      </w:r>
-      <w:r>
-        <w:t xml:space="preserve">sous des BLs originaux, et consignées à </w:t>
       </w:r>
       <w:r>
         <w:rPr>
@@ -355,17 +277,15 @@
         </w:rPr>
         <w:t>{{client_name}}</w:t>
       </w:r>
-      <w:proofErr w:type="spellStart"/>
-      <w:r>
-        <w:rPr>
+      <w:r>
+        <w:t xml:space="preserve"> sous des BLs originaux, et consignées à </w:t>
+      </w:r>
+      <w:r>
+        <w:rPr>
+          <w:b/>
           <w:color w:val="000000"/>
         </w:rPr>
-      </w:r>
-      <w:proofErr w:type="spellEnd"/>
-      <w:r>
-        <w:rPr>
-          <w:color w:val="000000"/>
-        </w:rPr>
+        <w:t>{{client_name}}</w:t>
       </w:r>
       <w:r>
         <w:t xml:space="preserve"> sous des sea waybills.</w:t>
@@ -381,7 +301,6 @@
       </w:pPr>
       <w:r>
         <w:rPr>
-          <w:b w:val="0"/>
           <w:color w:val="000000"/>
         </w:rPr>
         <w:t xml:space="preserve">Nous autorisons expressément MSC à délivrer nos marchandises à </w:t>
@@ -389,7 +308,6 @@
       <w:r>
         <w:rPr>
           <w:b/>
-          <w:i w:val="0"/>
           <w:color w:val="000000"/>
         </w:rPr>
         <w:t>{{transit_name}}</w:t>
@@ -428,18 +346,6 @@
         </w:rPr>
         <w:t>{{client_name}}</w:t>
       </w:r>
-      <w:proofErr w:type="spellStart"/>
-      <w:r>
-        <w:rPr>
-          <w:color w:val="000000"/>
-        </w:rPr>
-      </w:r>
-      <w:proofErr w:type="spellEnd"/>
-      <w:r>
-        <w:rPr>
-          <w:color w:val="000000"/>
-        </w:rPr>
-      </w:r>
       <w:r>
         <w:t>,</w:t>
       </w:r>
@@ -502,25 +408,8 @@
         </w:rPr>
         <w:t>{{transit_name}}</w:t>
       </w:r>
-      <w:proofErr w:type="spellStart"/>
-      <w:r>
-        <w:rPr>
-          <w:iCs/>
-          <w:color w:val="000000"/>
-        </w:rPr>
-      </w:r>
-      <w:proofErr w:type="spellEnd"/>
-      <w:r>
-        <w:rPr>
-          <w:iCs/>
-          <w:color w:val="000000"/>
-        </w:rPr>
-      </w:r>
-      <w:r>
-        <w:t xml:space="preserve">, </w:t>
-      </w:r>
-      <w:r>
-        <w:t xml:space="preserve">et nous </w:t>
+      <w:r>
+        <w:t xml:space="preserve">, et nous </w:t>
       </w:r>
       <w:r>
         <w:t xml:space="preserve">nous </w:t>
@@ -737,7 +626,11 @@
         <w:t xml:space="preserve"> les mesures techniques et organisationnel mises en place par MSC afin de protéger les données</w:t>
       </w:r>
       <w:r>
-        <w:t>, ainsi que sur nos droits d’information, d’accès, de rectification, et d’opposition, tel que prévu dans la Loi 18-07, mentionnée ci-haut, et le moyen et la manière de les exercer.</w:t>
+        <w:t xml:space="preserve">, ainsi que sur nos droits </w:t>
+      </w:r>
+      <w:r>
+        <w:lastRenderedPageBreak/>
+        <w:t>d’information, d’accès, de rectification, et d’opposition, tel que prévu dans la Loi 18-07, mentionnée ci-haut, et le moyen et la manière de les exercer.</w:t>
       </w:r>
     </w:p>
     <w:p>
@@ -769,23 +662,8 @@
         </w:rPr>
         <w:t>{{client_name}}</w:t>
       </w:r>
-      <w:proofErr w:type="spellStart"/>
-      <w:r>
-        <w:rPr>
-          <w:color w:val="000000"/>
-        </w:rPr>
-      </w:r>
-      <w:proofErr w:type="spellEnd"/>
-      <w:r>
-        <w:rPr>
-          <w:color w:val="000000"/>
-        </w:rPr>
-      </w:r>
-      <w:r>
-        <w:t xml:space="preserve">, </w:t>
-      </w:r>
-      <w:r>
-        <w:t xml:space="preserve">nous nous engageons à traiter les données à caractère personnel citées dans cette autorisation ou soumises ultérieurement par MSC dans le respect de la Loi 18-07, citée ci-dessus, et nous déclarons avoir mis en place toutes les mesures </w:t>
+      <w:r>
+        <w:t xml:space="preserve">, nous nous engageons à traiter les données à caractère personnel citées dans cette autorisation ou soumises ultérieurement par MSC dans le respect de la Loi 18-07, citée ci-dessus, et nous déclarons avoir mis en place toutes les mesures </w:t>
       </w:r>
       <w:r>
         <w:t xml:space="preserve">nécessaires garantissant leur protection. Toute demande d’exercice des droits doit être faite au </w:t>
@@ -797,80 +675,92 @@
         </w:rPr>
         <w:t>{{client_email}}</w:t>
       </w:r>
+      <w:r>
+        <w:t>.</w:t>
+      </w:r>
+    </w:p>
+    <w:p>
+      <w:pPr>
+        <w:jc w:val="both"/>
+      </w:pPr>
+    </w:p>
+    <w:p>
+      <w:pPr>
+        <w:ind w:left="720"/>
+      </w:pPr>
+    </w:p>
+    <w:p>
+      <w:r>
+        <w:rPr>
+          <w:b/>
+          <w:color w:val="000000"/>
+        </w:rPr>
+        <w:t>{{</w:t>
+      </w:r>
       <w:proofErr w:type="spellStart"/>
       <w:r>
         <w:rPr>
+          <w:b/>
           <w:color w:val="000000"/>
         </w:rPr>
+        <w:t>client_name</w:t>
       </w:r>
       <w:proofErr w:type="spellEnd"/>
       <w:r>
         <w:rPr>
+          <w:b/>
           <w:color w:val="000000"/>
         </w:rPr>
-      </w:r>
-      <w:r>
-        <w:t>.</w:t>
-      </w:r>
-    </w:p>
-    <w:p>
-      <w:pPr>
-        <w:jc w:val="both"/>
-      </w:pPr>
-    </w:p>
-    <w:p>
-      <w:pPr>
-        <w:ind w:left="720"/>
-      </w:pPr>
-    </w:p>
-    <w:p>
+        <w:t>}}</w:t>
+      </w:r>
+      <w:r>
+        <w:t xml:space="preserve">, </w:t>
+      </w:r>
+      <w:r>
+        <w:tab/>
+      </w:r>
+      <w:r>
+        <w:tab/>
+      </w:r>
+      <w:r>
+        <w:tab/>
+      </w:r>
+      <w:r>
+        <w:tab/>
+      </w:r>
+      <w:r>
+        <w:t xml:space="preserve">              </w:t>
+      </w:r>
+      <w:proofErr w:type="gramStart"/>
+      <w:r>
+        <w:t xml:space="preserve">   </w:t>
+      </w:r>
       <w:r>
         <w:rPr>
           <w:b/>
-          <w:i w:val="0"/>
-          <w:color w:val="000000"/>
-        </w:rPr>
-        <w:t>{{client_name}}</w:t>
-      </w:r>
+        </w:rPr>
+        <w:t>{</w:t>
+      </w:r>
+      <w:proofErr w:type="gramEnd"/>
       <w:r>
         <w:rPr>
           <w:b/>
-          <w:i/>
-          <w:color w:val="FF0000"/>
-        </w:rPr>
-      </w:r>
+        </w:rPr>
+        <w:t>{</w:t>
+      </w:r>
+      <w:proofErr w:type="spellStart"/>
       <w:r>
         <w:rPr>
           <w:b/>
-          <w:i/>
-          <w:color w:val="FF0000"/>
-        </w:rPr>
-      </w:r>
+        </w:rPr>
+        <w:t>transit_name</w:t>
+      </w:r>
+      <w:proofErr w:type="spellEnd"/>
       <w:r>
         <w:rPr>
           <w:b/>
-          <w:i/>
-          <w:color w:val="FF0000"/>
-        </w:rPr>
-      </w:r>
-      <w:r>
-        <w:t xml:space="preserve">, </w:t>
-      </w:r>
-      <w:r>
-        <w:tab/>
-      </w:r>
-      <w:r>
-        <w:tab/>
-      </w:r>
-      <w:r>
-        <w:tab/>
-      </w:r>
-      <w:r>
-        <w:tab/>
-        <w:t>Nom du transitaire</w:t>
-      </w:r>
-      <w:r>
-        <w:t>/mandataire</w:t>
+        </w:rPr>
+        <w:t>}}</w:t>
       </w:r>
     </w:p>
     <w:p>
@@ -956,8 +846,8 @@
         <w:tblLook w:val="04A0" w:firstRow="1" w:lastRow="0" w:firstColumn="1" w:lastColumn="0" w:noHBand="0" w:noVBand="1"/>
       </w:tblPr>
       <w:tblGrid>
-        <w:gridCol w:w="4945"/>
-        <w:gridCol w:w="4050"/>
+        <w:gridCol w:w="4951"/>
+        <w:gridCol w:w="4054"/>
       </w:tblGrid>
       <w:tr>
         <w:trPr>
@@ -1000,10 +890,6 @@
               </w:rPr>
               <w:t>{{client_name}}</w:t>
             </w:r>
-            <w:proofErr w:type="spellStart"/>
-            <w:r/>
-            <w:proofErr w:type="spellEnd"/>
-            <w:r/>
           </w:p>
         </w:tc>
         <w:tc>
@@ -1067,7 +953,6 @@
             <w:r>
               <w:rPr>
                 <w:b/>
-                <w:i w:val="0"/>
               </w:rPr>
               <w:t>{{transit_name}}</w:t>
             </w:r>
@@ -1125,10 +1010,6 @@
               </w:rPr>
               <w:t>{{client_email}}</w:t>
             </w:r>
-            <w:proofErr w:type="spellStart"/>
-            <w:r/>
-            <w:proofErr w:type="spellEnd"/>
-            <w:r/>
           </w:p>
         </w:tc>
         <w:tc>
@@ -1175,7 +1056,6 @@
             <w:r>
               <w:rPr>
                 <w:b/>
-                <w:i w:val="0"/>
               </w:rPr>
               <w:t>{{transit_email}}</w:t>
             </w:r>
@@ -1234,10 +1114,6 @@
               </w:rPr>
               <w:t>{{client_address}}</w:t>
             </w:r>
-            <w:proofErr w:type="spellStart"/>
-            <w:r/>
-            <w:proofErr w:type="spellEnd"/>
-            <w:r/>
           </w:p>
         </w:tc>
         <w:tc>
@@ -1284,12 +1160,9 @@
             <w:r>
               <w:rPr>
                 <w:b/>
-                <w:i w:val="0"/>
               </w:rPr>
               <w:t>{{transit_address}}</w:t>
             </w:r>
-            <w:proofErr w:type="spellStart"/>
-            <w:proofErr w:type="spellEnd"/>
           </w:p>
         </w:tc>
       </w:tr>
@@ -1341,15 +1214,10 @@
             <w:r>
               <w:rPr>
                 <w:b/>
-                <w:i w:val="0"/>
                 <w:color w:val="000000"/>
               </w:rPr>
               <w:t>{{client_username}}</w:t>
             </w:r>
-            <w:proofErr w:type="spellStart"/>
-            <w:r/>
-            <w:proofErr w:type="spellEnd"/>
-            <w:r/>
           </w:p>
         </w:tc>
         <w:tc>
@@ -1397,7 +1265,6 @@
             <w:r>
               <w:rPr>
                 <w:b/>
-                <w:i w:val="0"/>
               </w:rPr>
               <w:t>{{transit_username}}</w:t>
             </w:r>
@@ -1465,10 +1332,6 @@
               </w:rPr>
               <w:t>{{client_phone}}</w:t>
             </w:r>
-            <w:proofErr w:type="spellStart"/>
-            <w:r/>
-            <w:proofErr w:type="spellEnd"/>
-            <w:r/>
           </w:p>
         </w:tc>
         <w:tc>
@@ -1515,7 +1378,6 @@
             <w:r>
               <w:rPr>
                 <w:b/>
-                <w:i w:val="0"/>
               </w:rPr>
               <w:t>{{transit_phone}}</w:t>
             </w:r>
@@ -1600,8 +1462,8 @@
       </w:pPr>
     </w:p>
     <w:sectPr>
-      <w:footerReference w:type="default" r:id="rId8"/>
-      <w:headerReference w:type="default" r:id="rId11"/>
+      <w:headerReference w:type="default" r:id="rId8"/>
+      <w:footerReference w:type="default" r:id="rId9"/>
       <w:pgSz w:w="11906" w:h="16838"/>
       <w:pgMar w:top="993" w:right="1417" w:bottom="993" w:left="1417" w:header="708" w:footer="708" w:gutter="0"/>
       <w:cols w:space="708"/>
@@ -1692,12 +1554,8 @@
 </file>
 
 <file path=word/header1.xml><?xml version="1.0" encoding="utf-8"?>
-<w:hdr xmlns:m="http://schemas.openxmlformats.org/officeDocument/2006/math" xmlns:mc="http://schemas.openxmlformats.org/markup-compatibility/2006" xmlns:mo="http://schemas.microsoft.com/office/mac/office/2008/main" xmlns:mv="urn:schemas-microsoft-com:mac:vml" xmlns:o="urn:schemas-microsoft-com:office:office" xmlns:r="http://schemas.openxmlformats.org/officeDocument/2006/relationships" xmlns:v="urn:schemas-microsoft-com:vml" xmlns:w10="urn:schemas-microsoft-com:office:word" xmlns:w14="http://schemas.microsoft.com/office/word/2010/wordml" xmlns:w="http://schemas.openxmlformats.org/wordprocessingml/2006/main" xmlns:wne="http://schemas.microsoft.com/office/word/2006/wordml" xmlns:wp14="http://schemas.microsoft.com/office/word/2010/wordprocessingDrawing" xmlns:wp="http://schemas.openxmlformats.org/drawingml/2006/wordprocessingDrawing" xmlns:wpc="http://schemas.microsoft.com/office/word/2010/wordprocessingCanvas" xmlns:wpg="http://schemas.microsoft.com/office/word/2010/wordprocessingGroup" xmlns:wpi="http://schemas.microsoft.com/office/word/2010/wordprocessingInk" xmlns:wps="http://schemas.microsoft.com/office/word/2010/wordprocessingShape" mc:Ignorable="w14 wp14">
-  <w:p>
-    <w:pPr>
-      <w:pStyle w:val="Header"/>
-    </w:pPr>
-  </w:p>
+<w:hdr xmlns:wpc="http://schemas.microsoft.com/office/word/2010/wordprocessingCanvas" xmlns:cx="http://schemas.microsoft.com/office/drawing/2014/chartex" xmlns:cx1="http://schemas.microsoft.com/office/drawing/2015/9/8/chartex" xmlns:cx2="http://schemas.microsoft.com/office/drawing/2015/10/21/chartex" xmlns:cx3="http://schemas.microsoft.com/office/drawing/2016/5/9/chartex" xmlns:cx4="http://schemas.microsoft.com/office/drawing/2016/5/10/chartex" xmlns:cx5="http://schemas.microsoft.com/office/drawing/2016/5/11/chartex" xmlns:cx6="http://schemas.microsoft.com/office/drawing/2016/5/12/chartex" xmlns:cx7="http://schemas.microsoft.com/office/drawing/2016/5/13/chartex" xmlns:cx8="http://schemas.microsoft.com/office/drawing/2016/5/14/chartex" xmlns:mc="http://schemas.openxmlformats.org/markup-compatibility/2006" xmlns:aink="http://schemas.microsoft.com/office/drawing/2016/ink" xmlns:am3d="http://schemas.microsoft.com/office/drawing/2017/model3d" xmlns:o="urn:schemas-microsoft-com:office:office" xmlns:oel="http://schemas.microsoft.com/office/2019/extlst" xmlns:r="http://schemas.openxmlformats.org/officeDocument/2006/relationships" xmlns:m="http://schemas.openxmlformats.org/officeDocument/2006/math" xmlns:v="urn:schemas-microsoft-com:vml" xmlns:wp14="http://schemas.microsoft.com/office/word/2010/wordprocessingDrawing" xmlns:wp="http://schemas.openxmlformats.org/drawingml/2006/wordprocessingDrawing" xmlns:w10="urn:schemas-microsoft-com:office:word" xmlns:w="http://schemas.openxmlformats.org/wordprocessingml/2006/main" xmlns:w14="http://schemas.microsoft.com/office/word/2010/wordml" xmlns:w15="http://schemas.microsoft.com/office/word/2012/wordml" xmlns:w16cex="http://schemas.microsoft.com/office/word/2018/wordml/cex" xmlns:w16cid="http://schemas.microsoft.com/office/word/2016/wordml/cid" xmlns:w16="http://schemas.microsoft.com/office/word/2018/wordml" xmlns:w16sdtdh="http://schemas.microsoft.com/office/word/2020/wordml/sdtdatahash" xmlns:w16se="http://schemas.microsoft.com/office/word/2015/wordml/symex" xmlns:wpg="http://schemas.microsoft.com/office/word/2010/wordprocessingGroup" xmlns:wpi="http://schemas.microsoft.com/office/word/2010/wordprocessingInk" xmlns:wne="http://schemas.microsoft.com/office/word/2006/wordml" xmlns:wps="http://schemas.microsoft.com/office/word/2010/wordprocessingShape" mc:Ignorable="w14 w15 w16se w16cid w16 w16cex w16sdtdh wp14">
+  <w:p/>
 </w:hdr>
 </file>
 

</xml_diff>

<commit_message>
Adding facture and some UI update
</commit_message>
<xml_diff>
--- a/frontend/api/templates/MANDAT MSC.docx
+++ b/frontend/api/templates/MANDAT MSC.docx
@@ -197,6 +197,7 @@
       <w:pPr>
         <w:jc w:val="both"/>
       </w:pPr>
+      <w:proofErr w:type="gramStart"/>
       <w:r>
         <w:t>L</w:t>
       </w:r>
@@ -204,7 +205,11 @@
         <w:t xml:space="preserve">’objet </w:t>
       </w:r>
       <w:r>
-        <w:t xml:space="preserve"> de cette </w:t>
+        <w:t xml:space="preserve"> de</w:t>
+      </w:r>
+      <w:proofErr w:type="gramEnd"/>
+      <w:r>
+        <w:t xml:space="preserve"> cette </w:t>
       </w:r>
       <w:r>
         <w:t xml:space="preserve">autorisation </w:t>
@@ -319,7 +324,15 @@
         <w:t xml:space="preserve">contre la </w:t>
       </w:r>
       <w:r>
-        <w:t>présentation d’un BL original, ou d’une preuve d’identité dans le cas d’un sea waybill, à moins que nous ayons remis une note écrite antérieure à MSC stipulant le contraire.</w:t>
+        <w:t xml:space="preserve">présentation d’un BL original, ou d’une preuve d’identité dans le cas d’un sea waybill, à moins que nous ayons remis une note écrite antérieure à MSC stipulant le </w:t>
+      </w:r>
+      <w:proofErr w:type="gramStart"/>
+      <w:r>
+        <w:t>contraire</w:t>
+      </w:r>
+      <w:proofErr w:type="gramEnd"/>
+      <w:r>
+        <w:t>.</w:t>
       </w:r>
     </w:p>
     <w:p>
@@ -720,16 +733,7 @@
         <w:tab/>
       </w:r>
       <w:r>
-        <w:tab/>
-      </w:r>
-      <w:r>
-        <w:tab/>
-      </w:r>
-      <w:r>
-        <w:tab/>
-      </w:r>
-      <w:r>
-        <w:t xml:space="preserve">              </w:t>
+        <w:t xml:space="preserve">      </w:t>
       </w:r>
       <w:proofErr w:type="gramStart"/>
       <w:r>

</xml_diff>